<commit_message>
I added a word file for some business insights I concluded from the model and ana deleted unused libarries from the ipynb file
</commit_message>
<xml_diff>
--- a/Business insights.docx
+++ b/Business insights.docx
@@ -61,7 +61,23 @@
           <w:sz w:val="28"/>
           <w:szCs w:val="28"/>
         </w:rPr>
-        <w:t xml:space="preserve">The analysis revealed that month-to-month customers had the highest churn rate at 42.71%, while the two-year contract group only </w:t>
+        <w:t xml:space="preserve">The analysis </w:t>
+      </w:r>
+      <w:r>
+        <w:rPr>
+          <w:rFonts w:asciiTheme="majorBidi" w:hAnsiTheme="majorBidi" w:cstheme="majorBidi"/>
+          <w:sz w:val="28"/>
+          <w:szCs w:val="28"/>
+        </w:rPr>
+        <w:t>showed</w:t>
+      </w:r>
+      <w:r>
+        <w:rPr>
+          <w:rFonts w:asciiTheme="majorBidi" w:hAnsiTheme="majorBidi" w:cstheme="majorBidi"/>
+          <w:sz w:val="28"/>
+          <w:szCs w:val="28"/>
+        </w:rPr>
+        <w:t xml:space="preserve"> that month-to-month customers had the highest churn rate at 42.71%, while the two-year contract group only </w:t>
       </w:r>
       <w:r>
         <w:rPr>
@@ -77,7 +93,31 @@
           <w:sz w:val="28"/>
           <w:szCs w:val="28"/>
         </w:rPr>
-        <w:t xml:space="preserve"> at 2.85%. Therefore, the company should provide some incentives to customers on long-term contracts.</w:t>
+        <w:t xml:space="preserve"> at 2.85%. Therefore, the company should provide some </w:t>
+      </w:r>
+      <w:r>
+        <w:rPr>
+          <w:rFonts w:asciiTheme="majorBidi" w:hAnsiTheme="majorBidi" w:cstheme="majorBidi"/>
+          <w:sz w:val="28"/>
+          <w:szCs w:val="28"/>
+        </w:rPr>
+        <w:t>advantages</w:t>
+      </w:r>
+      <w:r>
+        <w:rPr>
+          <w:rFonts w:asciiTheme="majorBidi" w:hAnsiTheme="majorBidi" w:cstheme="majorBidi"/>
+          <w:sz w:val="28"/>
+          <w:szCs w:val="28"/>
+        </w:rPr>
+        <w:t xml:space="preserve"> to customers on long-term contracts</w:t>
+      </w:r>
+      <w:r>
+        <w:rPr>
+          <w:rFonts w:asciiTheme="majorBidi" w:hAnsiTheme="majorBidi" w:cstheme="majorBidi"/>
+          <w:sz w:val="28"/>
+          <w:szCs w:val="28"/>
+        </w:rPr>
+        <w:t xml:space="preserve"> and encourage month-to-month customers to upgrade their subscriptions.</w:t>
       </w:r>
     </w:p>
     <w:p>
@@ -117,7 +157,7 @@
           <w:sz w:val="28"/>
           <w:szCs w:val="28"/>
         </w:rPr>
-        <w:t xml:space="preserve">Customers that churned had an average tenure of 17.98 months, whereas customers that stayed had an average tenure of 37.65 months. Thus, the company should focus on improving its services and engaging with new customers since they are the ones </w:t>
+        <w:t xml:space="preserve">Customers that churned had an average tenure of 17.98 months, whereas customers that stayed had an average tenure of 37.65 months. Thus, the company should focus on improving its services with new customers since they are the ones </w:t>
       </w:r>
       <w:r>
         <w:rPr>
@@ -173,7 +213,23 @@
           <w:sz w:val="28"/>
           <w:szCs w:val="28"/>
         </w:rPr>
-        <w:t xml:space="preserve">Customers who churned had an average monthly charge of 74.44, whereas customers who stayed had an average monthly charge of 61.31. Hence, the company should create cheaper plans and provide discounts to customers who feel that the current price is too high. </w:t>
+        <w:t xml:space="preserve">Customers who churned had an average monthly charge of 74.44, whereas customers who stayed had an average monthly charge of 61.31. </w:t>
+      </w:r>
+      <w:r>
+        <w:rPr>
+          <w:rFonts w:asciiTheme="majorBidi" w:hAnsiTheme="majorBidi" w:cstheme="majorBidi"/>
+          <w:sz w:val="28"/>
+          <w:szCs w:val="28"/>
+        </w:rPr>
+        <w:t>So</w:t>
+      </w:r>
+      <w:r>
+        <w:rPr>
+          <w:rFonts w:asciiTheme="majorBidi" w:hAnsiTheme="majorBidi" w:cstheme="majorBidi"/>
+          <w:sz w:val="28"/>
+          <w:szCs w:val="28"/>
+        </w:rPr>
+        <w:t xml:space="preserve">, the company should create cheaper plans and provide discounts to customers who feel that the current price is too high. </w:t>
       </w:r>
     </w:p>
     <w:p>
@@ -213,7 +269,55 @@
           <w:sz w:val="28"/>
           <w:szCs w:val="28"/>
         </w:rPr>
-        <w:t>The AUC-ROC metric and Accuracy demonstrate that the model is rather efficient, with an accuracy of 80.38% and an ROC-AUC of 0.836. Therefore, the company should use it to find customers who are most likely to churn and try to retain them.</w:t>
+        <w:t xml:space="preserve">The AUC-ROC </w:t>
+      </w:r>
+      <w:r>
+        <w:rPr>
+          <w:rFonts w:asciiTheme="majorBidi" w:hAnsiTheme="majorBidi" w:cstheme="majorBidi"/>
+          <w:sz w:val="28"/>
+          <w:szCs w:val="28"/>
+        </w:rPr>
+        <w:t>analysis</w:t>
+      </w:r>
+      <w:r>
+        <w:rPr>
+          <w:rFonts w:asciiTheme="majorBidi" w:hAnsiTheme="majorBidi" w:cstheme="majorBidi"/>
+          <w:sz w:val="28"/>
+          <w:szCs w:val="28"/>
+        </w:rPr>
+        <w:t xml:space="preserve"> and Accuracy demonstrate that the model is rather efficient, with an accuracy of 80.38% and an ROC-AUC of 0.8</w:t>
+      </w:r>
+      <w:r>
+        <w:rPr>
+          <w:rFonts w:asciiTheme="majorBidi" w:hAnsiTheme="majorBidi" w:cstheme="majorBidi"/>
+          <w:sz w:val="28"/>
+          <w:szCs w:val="28"/>
+        </w:rPr>
+        <w:t>4</w:t>
+      </w:r>
+      <w:r>
+        <w:rPr>
+          <w:rFonts w:asciiTheme="majorBidi" w:hAnsiTheme="majorBidi" w:cstheme="majorBidi"/>
+          <w:sz w:val="28"/>
+          <w:szCs w:val="28"/>
+        </w:rPr>
+        <w:t xml:space="preserve">. Therefore, the company should use it to find customers who are most likely to churn and try to </w:t>
+      </w:r>
+      <w:r>
+        <w:rPr>
+          <w:rFonts w:asciiTheme="majorBidi" w:hAnsiTheme="majorBidi" w:cstheme="majorBidi"/>
+          <w:sz w:val="28"/>
+          <w:szCs w:val="28"/>
+        </w:rPr>
+        <w:t>keep</w:t>
+      </w:r>
+      <w:r>
+        <w:rPr>
+          <w:rFonts w:asciiTheme="majorBidi" w:hAnsiTheme="majorBidi" w:cstheme="majorBidi"/>
+          <w:sz w:val="28"/>
+          <w:szCs w:val="28"/>
+        </w:rPr>
+        <w:t xml:space="preserve"> them.</w:t>
       </w:r>
     </w:p>
     <w:sectPr>
@@ -829,6 +933,7 @@
   <w:style w:type="character" w:default="1" w:styleId="DefaultParagraphFont">
     <w:name w:val="Default Paragraph Font"/>
     <w:uiPriority w:val="1"/>
+    <w:semiHidden/>
     <w:unhideWhenUsed/>
   </w:style>
   <w:style w:type="table" w:default="1" w:styleId="TableNormal">

</xml_diff>